<commit_message>
Data Ingestion and validatoin
</commit_message>
<xml_diff>
--- a/Plan.docx
+++ b/Plan.docx
@@ -210,6 +210,29 @@
         <w:spacing w:after="0"/>
       </w:pPr>
       <w:r>
+        <w:t xml:space="preserve">Ensure </w:t>
+      </w:r>
+      <w:r>
+        <w:t xml:space="preserve">Tick sighting information </w:t>
+      </w:r>
+      <w:r>
+        <w:t xml:space="preserve">is </w:t>
+      </w:r>
+      <w:r>
+        <w:t xml:space="preserve">easily </w:t>
+      </w:r>
+      <w:r>
+        <w:t>readable and accessible</w:t>
+      </w:r>
+      <w:r>
+        <w:t xml:space="preserve"> by users</w:t>
+      </w:r>
+    </w:p>
+    <w:p>
+      <w:pPr>
+        <w:spacing w:after="0"/>
+      </w:pPr>
+      <w:r>
         <w:t xml:space="preserve">Data consumption into </w:t>
       </w:r>
       <w:r>
@@ -291,8 +314,13 @@
         <w:t>Working API Service</w:t>
       </w:r>
       <w:r>
-        <w:t xml:space="preserve"> running under uvicorn</w:t>
-      </w:r>
+        <w:t xml:space="preserve"> running under </w:t>
+      </w:r>
+      <w:proofErr w:type="spellStart"/>
+      <w:r>
+        <w:t>uvicorn</w:t>
+      </w:r>
+      <w:proofErr w:type="spellEnd"/>
     </w:p>
     <w:p>
       <w:pPr>
@@ -354,9 +382,11 @@
       <w:pPr>
         <w:spacing w:after="0"/>
       </w:pPr>
+      <w:proofErr w:type="spellStart"/>
       <w:r>
         <w:t>Dockerfile</w:t>
       </w:r>
+      <w:proofErr w:type="spellEnd"/>
     </w:p>
     <w:p>
       <w:pPr>
@@ -469,8 +499,13 @@
         </w:numPr>
         <w:spacing w:after="0"/>
       </w:pPr>
-      <w:r>
-        <w:t>Analystic endpoint implementation (trends etc)</w:t>
+      <w:proofErr w:type="spellStart"/>
+      <w:r>
+        <w:t>Analystic</w:t>
+      </w:r>
+      <w:proofErr w:type="spellEnd"/>
+      <w:r>
+        <w:t xml:space="preserve"> endpoint implementation (trends etc)</w:t>
       </w:r>
     </w:p>
     <w:p>
@@ -511,9 +546,11 @@
         </w:numPr>
         <w:spacing w:after="0"/>
       </w:pPr>
+      <w:proofErr w:type="spellStart"/>
       <w:r>
         <w:t>Dockerfile</w:t>
       </w:r>
+      <w:proofErr w:type="spellEnd"/>
     </w:p>
     <w:p>
       <w:pPr>
@@ -525,13 +562,7 @@
         <w:spacing w:after="0"/>
       </w:pPr>
       <w:r>
-        <w:t>README</w:t>
-      </w:r>
-      <w:r>
-        <w:t xml:space="preserve"> and documentation</w:t>
-      </w:r>
-      <w:r>
-        <w:t xml:space="preserve"> + walkthrough video</w:t>
+        <w:t>README and documentation + walkthrough video</w:t>
       </w:r>
     </w:p>
     <w:p>
@@ -556,6 +587,7 @@
           <w:sz w:val="32"/>
           <w:szCs w:val="32"/>
         </w:rPr>
+        <w:lastRenderedPageBreak/>
         <w:t>Architecture overview</w:t>
       </w:r>
     </w:p>
@@ -564,7 +596,6 @@
         <w:spacing w:after="0"/>
       </w:pPr>
       <w:r>
-        <w:lastRenderedPageBreak/>
         <w:t>Data consumption layer -&gt;</w:t>
       </w:r>
     </w:p>
@@ -623,11 +654,16 @@
       <w:r>
         <w:t xml:space="preserve"> </w:t>
       </w:r>
+      <w:proofErr w:type="spellStart"/>
       <w:r>
         <w:t>D</w:t>
       </w:r>
       <w:r>
-        <w:t>ataFrame for as long as application is running</w:t>
+        <w:t>ataFrame</w:t>
+      </w:r>
+      <w:proofErr w:type="spellEnd"/>
+      <w:r>
+        <w:t xml:space="preserve"> for as long as application is running</w:t>
       </w:r>
     </w:p>
     <w:p>
@@ -651,8 +687,13 @@
         <w:t>FAST API endpoints</w:t>
       </w:r>
       <w:r>
-        <w:t xml:space="preserve"> querying the dataframe</w:t>
-      </w:r>
+        <w:t xml:space="preserve"> querying the </w:t>
+      </w:r>
+      <w:proofErr w:type="spellStart"/>
+      <w:r>
+        <w:t>dataframe</w:t>
+      </w:r>
+      <w:proofErr w:type="spellEnd"/>
     </w:p>
     <w:p>
       <w:pPr>
@@ -663,8 +704,13 @@
         </w:numPr>
         <w:spacing w:after="0"/>
       </w:pPr>
-      <w:r>
-        <w:t>Uvicorn for running server</w:t>
+      <w:proofErr w:type="spellStart"/>
+      <w:r>
+        <w:t>Uvicorn</w:t>
+      </w:r>
+      <w:proofErr w:type="spellEnd"/>
+      <w:r>
+        <w:t xml:space="preserve"> for running server</w:t>
       </w:r>
     </w:p>
     <w:p>
@@ -731,7 +777,15 @@
         <w:spacing w:after="0"/>
       </w:pPr>
       <w:r>
-        <w:t>Since the database is the tick-sighting.xlsx file, If I ‘COPY’ the file in the Dockerfile, I would have to rebuild the image every time the Excel sheet changes. This isn’t necessary as I am assuming the data won’t be changing.</w:t>
+        <w:t xml:space="preserve">Since the database is the tick-sighting.xlsx file, If I ‘COPY’ the file in the </w:t>
+      </w:r>
+      <w:proofErr w:type="spellStart"/>
+      <w:r>
+        <w:t>Dockerfile</w:t>
+      </w:r>
+      <w:proofErr w:type="spellEnd"/>
+      <w:r>
+        <w:t>, I would have to rebuild the image every time the Excel sheet changes. This isn’t necessary as I am assuming the data won’t be changing.</w:t>
       </w:r>
     </w:p>
     <w:p>
@@ -744,15 +798,47 @@
         <w:spacing w:after="0"/>
       </w:pPr>
       <w:r>
-        <w:t>Pandas uses NaN for missing data whereas JSON requires None, the ingestion layer much change any data saying NaN to None.</w:t>
-      </w:r>
-    </w:p>
-    <w:p>
-      <w:pPr>
-        <w:spacing w:after="0"/>
-      </w:pPr>
-      <w:r>
-        <w:t>Tools: Python, Pandas, FastAPI, Uvicorn, Docker</w:t>
+        <w:t xml:space="preserve">Pandas uses </w:t>
+      </w:r>
+      <w:proofErr w:type="spellStart"/>
+      <w:r>
+        <w:t>NaN</w:t>
+      </w:r>
+      <w:proofErr w:type="spellEnd"/>
+      <w:r>
+        <w:t xml:space="preserve"> for missing data whereas JSON requires None, the ingestion layer much change any data saying </w:t>
+      </w:r>
+      <w:proofErr w:type="spellStart"/>
+      <w:r>
+        <w:t>NaN</w:t>
+      </w:r>
+      <w:proofErr w:type="spellEnd"/>
+      <w:r>
+        <w:t xml:space="preserve"> to None.</w:t>
+      </w:r>
+    </w:p>
+    <w:p>
+      <w:pPr>
+        <w:spacing w:after="0"/>
+      </w:pPr>
+      <w:r>
+        <w:t xml:space="preserve">Tools: Python, Pandas, </w:t>
+      </w:r>
+      <w:proofErr w:type="spellStart"/>
+      <w:r>
+        <w:t>FastAPI</w:t>
+      </w:r>
+      <w:proofErr w:type="spellEnd"/>
+      <w:r>
+        <w:t xml:space="preserve">, </w:t>
+      </w:r>
+      <w:proofErr w:type="spellStart"/>
+      <w:r>
+        <w:t>Uvicorn</w:t>
+      </w:r>
+      <w:proofErr w:type="spellEnd"/>
+      <w:r>
+        <w:t>, Docker</w:t>
       </w:r>
     </w:p>
     <w:sectPr>

</xml_diff>